<commit_message>
Updating YakShaver link in the document
</commit_message>
<xml_diff>
--- a/Templates/02-employee-review-kpis.docx
+++ b/Templates/02-employee-review-kpis.docx
@@ -2228,16 +2228,8 @@
         <w:rPr>
           <w:lang w:val="en-AU"/>
         </w:rPr>
-        <w:t xml:space="preserve">3. Already done Client Love with their clients </w:t>
-      </w:r>
-      <w:proofErr w:type="gramStart"/>
-      <w:r>
-        <w:rPr>
-          <w:lang w:val="en-AU"/>
-        </w:rPr>
-        <w:t>above?</w:t>
-      </w:r>
-      <w:proofErr w:type="gramEnd"/>
+        <w:t>3. Already done Client Love with their clients above?</w:t>
+      </w:r>
     </w:p>
     <w:p>
       <w:pPr>
@@ -5444,16 +5436,6 @@
         <w:keepLines/>
         <w:spacing w:line="240" w:lineRule="auto"/>
       </w:pPr>
-      <w:r>
-        <w:t>Teams | SSW YakShaver | Type: leaderboard -time year -top 100</w:t>
-      </w:r>
-    </w:p>
-    <w:p>
-      <w:pPr>
-        <w:keepNext/>
-        <w:keepLines/>
-        <w:spacing w:line="240" w:lineRule="auto"/>
-      </w:pPr>
       <w:proofErr w:type="gramStart"/>
       <w:r>
         <w:t>{{ SCREENSHOT</w:t>
@@ -5613,6 +5595,36 @@
     </w:p>
     <w:bookmarkEnd w:id="19"/>
     <w:bookmarkEnd w:id="20"/>
+    <w:p>
+      <w:r>
+        <w:fldChar w:fldCharType="begin"/>
+      </w:r>
+      <w:r>
+        <w:instrText>HYPERLINK "</w:instrText>
+      </w:r>
+      <w:r>
+        <w:instrText>https://portal.yakshaver.ai/leaderboard?range=last-12-month</w:instrText>
+      </w:r>
+      <w:r>
+        <w:instrText>"</w:instrText>
+      </w:r>
+      <w:r>
+        <w:fldChar w:fldCharType="separate"/>
+      </w:r>
+      <w:r>
+        <w:rPr>
+          <w:rStyle w:val="Hyperlink"/>
+          <w:szCs w:val="24"/>
+        </w:rPr>
+        <w:t>https://portal.yakshaver.ai/leaderboard?range=last-12-month</w:t>
+      </w:r>
+      <w:r>
+        <w:fldChar w:fldCharType="end"/>
+      </w:r>
+      <w:r>
+        <w:t xml:space="preserve"> </w:t>
+      </w:r>
+    </w:p>
     <w:p/>
     <w:p>
       <w:pPr>
@@ -6420,7 +6432,7 @@
         <w:sz w:val="14"/>
         <w:szCs w:val="14"/>
       </w:rPr>
-      <w:t>10/01/2026 1:00 AM</w:t>
+      <w:t>7/07/2026 2:47 PM</w:t>
     </w:r>
     <w:r>
       <w:rPr>
@@ -8977,6 +8989,19 @@
 </file>
 
 <file path=customXml/item1.xml><?xml version="1.0" encoding="utf-8"?>
+<b:Sources xmlns:b="http://schemas.openxmlformats.org/officeDocument/2006/bibliography" xmlns="http://schemas.openxmlformats.org/officeDocument/2006/bibliography" SelectedStyle="\APASixthEditionOfficeOnline.xsl" StyleName="APA" Version="6"/>
+</file>
+
+<file path=customXml/item2.xml><?xml version="1.0" encoding="utf-8"?>
+<?mso-contentType ?>
+<FormTemplates xmlns="http://schemas.microsoft.com/sharepoint/v3/contenttype/forms">
+  <Display>DocumentLibraryForm</Display>
+  <Edit>DocumentLibraryForm</Edit>
+  <New>DocumentLibraryForm</New>
+</FormTemplates>
+</file>
+
+<file path=customXml/item3.xml><?xml version="1.0" encoding="utf-8"?>
 <p:properties xmlns:p="http://schemas.microsoft.com/office/2006/metadata/properties" xmlns:xsi="http://www.w3.org/2001/XMLSchema-instance" xmlns:pc="http://schemas.microsoft.com/office/infopath/2007/PartnerControls">
   <documentManagement>
     <_ip_UnifiedCompliancePolicyUIAction xmlns="http://schemas.microsoft.com/sharepoint/v3" xsi:nil="true"/>
@@ -8989,7 +9014,7 @@
 </p:properties>
 </file>
 
-<file path=customXml/item2.xml><?xml version="1.0" encoding="utf-8"?>
+<file path=customXml/item4.xml><?xml version="1.0" encoding="utf-8"?>
 <ct:contentTypeSchema xmlns:ct="http://schemas.microsoft.com/office/2006/metadata/contentType" xmlns:ma="http://schemas.microsoft.com/office/2006/metadata/properties/metaAttributes" ct:_="" ma:_="" ma:contentTypeName="Document" ma:contentTypeID="0x010100EF9B896C278B3E4A966930FF26B3A803" ma:contentTypeVersion="17" ma:contentTypeDescription="Create a new document." ma:contentTypeScope="" ma:versionID="810953195a06a54db76f0e1c86e54065">
   <xsd:schema xmlns:xsd="http://www.w3.org/2001/XMLSchema" xmlns:xs="http://www.w3.org/2001/XMLSchema" xmlns:p="http://schemas.microsoft.com/office/2006/metadata/properties" xmlns:ns1="http://schemas.microsoft.com/sharepoint/v3" xmlns:ns2="212980c9-5617-46ce-99ad-a376bd4152d0" xmlns:ns3="0ecd88e7-26cc-4a6b-8b5c-6a9962e64f6a" targetNamespace="http://schemas.microsoft.com/office/2006/metadata/properties" ma:root="true" ma:fieldsID="1224343d2e659e4bb839ffaafaceb3e5" ns1:_="" ns2:_="" ns3:_="">
     <xsd:import namespace="http://schemas.microsoft.com/sharepoint/v3"/>
@@ -9237,20 +9262,23 @@
 </ct:contentTypeSchema>
 </file>
 
-<file path=customXml/item3.xml><?xml version="1.0" encoding="utf-8"?>
-<b:Sources xmlns:b="http://schemas.openxmlformats.org/officeDocument/2006/bibliography" xmlns="http://schemas.openxmlformats.org/officeDocument/2006/bibliography" SelectedStyle="\APASixthEditionOfficeOnline.xsl" StyleName="APA" Version="6"/>
+<file path=customXml/itemProps1.xml><?xml version="1.0" encoding="utf-8"?>
+<ds:datastoreItem xmlns:ds="http://schemas.openxmlformats.org/officeDocument/2006/customXml" ds:itemID="{D7A003FC-89FC-4320-9A93-DBEA7E2F4C59}">
+  <ds:schemaRefs>
+    <ds:schemaRef ds:uri="http://schemas.openxmlformats.org/officeDocument/2006/bibliography"/>
+  </ds:schemaRefs>
+</ds:datastoreItem>
 </file>
 
-<file path=customXml/item4.xml><?xml version="1.0" encoding="utf-8"?>
-<?mso-contentType ?>
-<FormTemplates xmlns="http://schemas.microsoft.com/sharepoint/v3/contenttype/forms">
-  <Display>DocumentLibraryForm</Display>
-  <Edit>DocumentLibraryForm</Edit>
-  <New>DocumentLibraryForm</New>
-</FormTemplates>
+<file path=customXml/itemProps2.xml><?xml version="1.0" encoding="utf-8"?>
+<ds:datastoreItem xmlns:ds="http://schemas.openxmlformats.org/officeDocument/2006/customXml" ds:itemID="{A40E3940-A19E-4C5F-9921-8B36449287B1}">
+  <ds:schemaRefs>
+    <ds:schemaRef ds:uri="http://schemas.microsoft.com/sharepoint/v3/contenttype/forms"/>
+  </ds:schemaRefs>
+</ds:datastoreItem>
 </file>
 
-<file path=customXml/itemProps1.xml><?xml version="1.0" encoding="utf-8"?>
+<file path=customXml/itemProps3.xml><?xml version="1.0" encoding="utf-8"?>
 <ds:datastoreItem xmlns:ds="http://schemas.openxmlformats.org/officeDocument/2006/customXml" ds:itemID="{33307C42-A627-4970-BC11-0EFB0BA59FEE}">
   <ds:schemaRefs>
     <ds:schemaRef ds:uri="http://schemas.microsoft.com/office/2006/metadata/properties"/>
@@ -9262,7 +9290,7 @@
 </ds:datastoreItem>
 </file>
 
-<file path=customXml/itemProps2.xml><?xml version="1.0" encoding="utf-8"?>
+<file path=customXml/itemProps4.xml><?xml version="1.0" encoding="utf-8"?>
 <ds:datastoreItem xmlns:ds="http://schemas.openxmlformats.org/officeDocument/2006/customXml" ds:itemID="{4E0C56D0-03FF-4681-BB98-221CE98599A3}">
   <ds:schemaRefs>
     <ds:schemaRef ds:uri="http://schemas.microsoft.com/office/2006/metadata/contentType"/>
@@ -9280,20 +9308,4 @@
     <ds:schemaRef ds:uri="http://schemas.microsoft.com/internal/obd"/>
   </ds:schemaRefs>
 </ds:datastoreItem>
-</file>
-
-<file path=customXml/itemProps3.xml><?xml version="1.0" encoding="utf-8"?>
-<ds:datastoreItem xmlns:ds="http://schemas.openxmlformats.org/officeDocument/2006/customXml" ds:itemID="{D7A003FC-89FC-4320-9A93-DBEA7E2F4C59}">
-  <ds:schemaRefs>
-    <ds:schemaRef ds:uri="http://schemas.openxmlformats.org/officeDocument/2006/bibliography"/>
-  </ds:schemaRefs>
-</ds:datastoreItem>
-</file>
-
-<file path=customXml/itemProps4.xml><?xml version="1.0" encoding="utf-8"?>
-<ds:datastoreItem xmlns:ds="http://schemas.openxmlformats.org/officeDocument/2006/customXml" ds:itemID="{A40E3940-A19E-4C5F-9921-8B36449287B1}">
-  <ds:schemaRefs>
-    <ds:schemaRef ds:uri="http://schemas.microsoft.com/sharepoint/v3/contenttype/forms"/>
-  </ds:schemaRefs>
-</ds:datastoreItem>
 </file>
</xml_diff>